<commit_message>
Improve questionnaire flows, resource navigation, and test imports
</commit_message>
<xml_diff>
--- a/resources.docx
+++ b/resources.docx
@@ -3853,6 +3853,16 @@
       </w:r>
     </w:p>
     <w:p>
+      <w:hyperlink r:id="rIdFeedback82">
+        <w:r>
+          <w:rPr>
+            <w:rStyle w:val="Hyperlnk"/>
+          </w:rPr>
+          <w:t xml:space="preserve">Läs hela instruktionen för hur du använder vaginalstaven.</w:t>
+        </w:r>
+      </w:hyperlink>
+    </w:p>
+    <w:p>
       <w:pPr>
         <w:pStyle w:val="Normal"/>
       </w:pPr>
@@ -5572,6 +5582,16 @@
           </mc:Fallback>
         </mc:AlternateContent>
       </w:r>
+    </w:p>
+    <w:p>
+      <w:hyperlink r:id="rIdFeedback83">
+        <w:r>
+          <w:rPr>
+            <w:rStyle w:val="Hyperlnk"/>
+          </w:rPr>
+          <w:t xml:space="preserve">Läs mer om relationer och sexualitet.</w:t>
+        </w:r>
+      </w:hyperlink>
     </w:p>
     <w:p>
       <w:pPr>
@@ -6641,8 +6661,16 @@
         <w:br/>
       </w:r>
       <w:r>
-        <w:t>Ring: 020-50 50 50</w:t>
-      </w:r>
+        <w:t xml:space="preserve">Ring: </w:t>
+      </w:r>
+      <w:hyperlink r:id="rIdFeedback79">
+        <w:r>
+          <w:rPr>
+            <w:rStyle w:val="Hyperlnk"/>
+          </w:rPr>
+          <w:t xml:space="preserve">020-50 50 50</w:t>
+        </w:r>
+      </w:hyperlink>
     </w:p>
     <w:p>
       <w:pPr/>
@@ -7527,8 +7555,16 @@
         <w:br/>
       </w:r>
       <w:r>
-        <w:t>Ring: 020-50 50 50</w:t>
-      </w:r>
+        <w:t xml:space="preserve">Ring: </w:t>
+      </w:r>
+      <w:hyperlink r:id="rIdFeedback80">
+        <w:r>
+          <w:rPr>
+            <w:rStyle w:val="Hyperlnk"/>
+          </w:rPr>
+          <w:t xml:space="preserve">020-50 50 50</w:t>
+        </w:r>
+      </w:hyperlink>
     </w:p>
     <w:p>
       <w:commentRangeStart w:id="10"/>
@@ -8164,10 +8200,14 @@
       <w:r>
         <w:br/>
       </w:r>
-      <w:r>
-        <w:rPr/>
-        <w:t>031-342 89 77</w:t>
-      </w:r>
+      <w:hyperlink r:id="rIdFeedback81">
+        <w:r>
+          <w:rPr>
+            <w:rStyle w:val="Hyperlnk"/>
+          </w:rPr>
+          <w:t xml:space="preserve">031-342 89 77</w:t>
+        </w:r>
+      </w:hyperlink>
       <w:r>
         <w:rPr/>
         <w:t xml:space="preserve"> </w:t>
@@ -9888,6 +9928,55 @@
           <w:t xml:space="preserve">linda.akeflo@gu.se</w:t>
         </w:r>
       </w:hyperlink>
+    </w:p>
+    <w:p>
+      <w:pPr>
+        <w:pStyle w:val="Rubrik1Sd"/>
+        <w:pageBreakBefore/>
+        <w:pageBreakBefore/>
+      </w:pPr>
+      <w:r>
+        <w:t xml:space="preserve">Förklaringar till frågeformulären</w:t>
+      </w:r>
+    </w:p>
+    <w:p>
+      <w:pPr>
+        <w:pStyle w:val="Rubrik2Sd"/>
+      </w:pPr>
+      <w:r>
+        <w:t xml:space="preserve">Närstående</w:t>
+      </w:r>
+    </w:p>
+    <w:p>
+      <w:r>
+        <w:t xml:space="preserve">Med närstående menar vi partner, familjemedlem, släkting eller annan viktig person.</w:t>
+      </w:r>
+    </w:p>
+    <w:p>
+      <w:pPr>
+        <w:pStyle w:val="Rubrik2Sd"/>
+      </w:pPr>
+      <w:r>
+        <w:t xml:space="preserve">Vaginalt sex</w:t>
+      </w:r>
+    </w:p>
+    <w:p>
+      <w:r>
+        <w:t xml:space="preserve">Med vaginalt sex menar vi här sexuell aktivitet själv eller med partner där något förs in i slidan (exempelvis penis, fingrar, föremål eller dildo).</w:t>
+      </w:r>
+    </w:p>
+    <w:p>
+      <w:pPr>
+        <w:pStyle w:val="Rubrik2Sd"/>
+      </w:pPr>
+      <w:r>
+        <w:t xml:space="preserve">Hormonplåster</w:t>
+      </w:r>
+    </w:p>
+    <w:p>
+      <w:r>
+        <w:t xml:space="preserve">Svara Ja om du använder hormonbehandling via hud, t.ex. plåster, gel eller spray.</w:t>
+      </w:r>
     </w:p>
     <w:sectPr>
       <w:pgSz w:w="11906" w:h="16838" w:orient="portrait"/>

</xml_diff>